<commit_message>
feat: :sparkles: Changes in testing
</commit_message>
<xml_diff>
--- a/reports/C2/Student #3/S03.docx
+++ b/reports/C2/Student #3/S03.docx
@@ -928,7 +928,15 @@
         </w:rPr>
       </w:pPr>
       <w:r>
-        <w:t>Provide a link to your planning dashboard in GitHub to review the tasks, their current status, and your schedule</w:t>
+        <w:t xml:space="preserve">Provide a link to your planning dashboard in GitHub to review the tasks, their </w:t>
+      </w:r>
+      <w:proofErr w:type="gramStart"/>
+      <w:r>
+        <w:t>current status</w:t>
+      </w:r>
+      <w:proofErr w:type="gramEnd"/>
+      <w:r>
+        <w:t>, and your schedule</w:t>
       </w:r>
       <w:r>
         <w:t xml:space="preserve">.  </w:t>
@@ -1328,12 +1336,14 @@
       <w:r>
         <w:t xml:space="preserve"> of the last update (in the past), the </w:t>
       </w:r>
+      <w:proofErr w:type="gramStart"/>
       <w:r>
         <w:rPr>
           <w:b/>
         </w:rPr>
         <w:t>current status</w:t>
       </w:r>
+      <w:proofErr w:type="gramEnd"/>
       <w:r>
         <w:t xml:space="preserve"> of the assignment ("CONFIRMED", "PENDING", or "CANCELLED"), and some </w:t>
       </w:r>
@@ -1643,21 +1653,25 @@
       <w:r>
         <w:t>accounts with credentials “</w:t>
       </w:r>
+      <w:proofErr w:type="spellStart"/>
       <w:r>
         <w:rPr>
           <w:b/>
         </w:rPr>
         <w:t>memberX</w:t>
       </w:r>
+      <w:proofErr w:type="spellEnd"/>
       <w:r>
         <w:t>/</w:t>
       </w:r>
+      <w:proofErr w:type="spellStart"/>
       <w:r>
         <w:rPr>
           <w:b/>
         </w:rPr>
         <w:t>memberX</w:t>
       </w:r>
+      <w:proofErr w:type="spellEnd"/>
       <w:r>
         <w:t xml:space="preserve">” </w:t>
       </w:r>
@@ -1779,7 +1793,15 @@
         </w:rPr>
       </w:pPr>
       <w:r>
-        <w:t>Provide a link to your planning dashboard in GitHub to review the tasks, their current status, and your schedule</w:t>
+        <w:t xml:space="preserve">Provide a link to your planning dashboard in GitHub to review the tasks, their </w:t>
+      </w:r>
+      <w:proofErr w:type="gramStart"/>
+      <w:r>
+        <w:t>current status</w:t>
+      </w:r>
+      <w:proofErr w:type="gramEnd"/>
+      <w:r>
+        <w:t>, and your schedule</w:t>
       </w:r>
       <w:r>
         <w:t xml:space="preserve">.  </w:t>
@@ -2043,7 +2065,15 @@
         <w:t xml:space="preserve">. </w:t>
       </w:r>
       <w:r>
-        <w:t xml:space="preserve"> Flight assignments can be updated or deleted as long as they have not been published</w:t>
+        <w:t xml:space="preserve"> Flight assignments can be updated or deleted </w:t>
+      </w:r>
+      <w:proofErr w:type="gramStart"/>
+      <w:r>
+        <w:t>as long as</w:t>
+      </w:r>
+      <w:proofErr w:type="gramEnd"/>
+      <w:r>
+        <w:t xml:space="preserve"> they have not been published</w:t>
       </w:r>
       <w:r>
         <w:t>.</w:t>
@@ -2243,18 +2273,74 @@
         <w:rPr>
           <w:lang w:val="es-ES"/>
         </w:rPr>
-        <w:t xml:space="preserve"> Al intentar borrar un activity log, obtengo un error de pánico. Para reproducirlo. Popular con sample data &gt; login con member1 &gt; </w:t>
-      </w:r>
+        <w:t xml:space="preserve"> Al intentar borrar un </w:t>
+      </w:r>
+      <w:proofErr w:type="spellStart"/>
       <w:r>
         <w:rPr>
           <w:lang w:val="es-ES"/>
         </w:rPr>
-        <w:t xml:space="preserve">listar los flight assigments </w:t>
-      </w:r>
+        <w:t>activity</w:t>
+      </w:r>
+      <w:proofErr w:type="spellEnd"/>
       <w:r>
         <w:rPr>
           <w:lang w:val="es-ES"/>
         </w:rPr>
+        <w:t xml:space="preserve"> log, obtengo un error de pánico. Para reproducirlo. Popular con </w:t>
+      </w:r>
+      <w:proofErr w:type="spellStart"/>
+      <w:r>
+        <w:rPr>
+          <w:lang w:val="es-ES"/>
+        </w:rPr>
+        <w:t>sample</w:t>
+      </w:r>
+      <w:proofErr w:type="spellEnd"/>
+      <w:r>
+        <w:rPr>
+          <w:lang w:val="es-ES"/>
+        </w:rPr>
+        <w:t xml:space="preserve"> data &gt; login con member1 &gt; </w:t>
+      </w:r>
+      <w:r>
+        <w:rPr>
+          <w:lang w:val="es-ES"/>
+        </w:rPr>
+        <w:t xml:space="preserve">listar los </w:t>
+      </w:r>
+      <w:proofErr w:type="spellStart"/>
+      <w:r>
+        <w:rPr>
+          <w:lang w:val="es-ES"/>
+        </w:rPr>
+        <w:t>flight</w:t>
+      </w:r>
+      <w:proofErr w:type="spellEnd"/>
+      <w:r>
+        <w:rPr>
+          <w:lang w:val="es-ES"/>
+        </w:rPr>
+        <w:t xml:space="preserve"> </w:t>
+      </w:r>
+      <w:proofErr w:type="spellStart"/>
+      <w:r>
+        <w:rPr>
+          <w:lang w:val="es-ES"/>
+        </w:rPr>
+        <w:t>assigments</w:t>
+      </w:r>
+      <w:proofErr w:type="spellEnd"/>
+      <w:r>
+        <w:rPr>
+          <w:lang w:val="es-ES"/>
+        </w:rPr>
+        <w:t xml:space="preserve"> </w:t>
+      </w:r>
+      <w:r>
+        <w:rPr>
+          <w:lang w:val="es-ES"/>
+        </w:rPr>
         <w:t xml:space="preserve">completados </w:t>
       </w:r>
       <w:r>
@@ -2267,19 +2353,61 @@
         <w:rPr>
           <w:lang w:val="es-ES"/>
         </w:rPr>
-        <w:t xml:space="preserve">hacer un show del primero (id </w:t>
-      </w:r>
+        <w:t xml:space="preserve">hacer un </w:t>
+      </w:r>
+      <w:proofErr w:type="gramStart"/>
       <w:r>
         <w:rPr>
           <w:lang w:val="es-ES"/>
         </w:rPr>
+        <w:t>show</w:t>
+      </w:r>
+      <w:proofErr w:type="gramEnd"/>
+      <w:r>
+        <w:rPr>
+          <w:lang w:val="es-ES"/>
+        </w:rPr>
+        <w:t xml:space="preserve"> del primero (id </w:t>
+      </w:r>
+      <w:r>
+        <w:rPr>
+          <w:lang w:val="es-ES"/>
+        </w:rPr>
         <w:t>259</w:t>
       </w:r>
       <w:r>
         <w:rPr>
           <w:lang w:val="es-ES"/>
         </w:rPr>
-        <w:t xml:space="preserve">) &gt; listar sus activity logs &gt; hacer un show del primero (id </w:t>
+        <w:t xml:space="preserve">) &gt; listar sus </w:t>
+      </w:r>
+      <w:proofErr w:type="spellStart"/>
+      <w:r>
+        <w:rPr>
+          <w:lang w:val="es-ES"/>
+        </w:rPr>
+        <w:t>activity</w:t>
+      </w:r>
+      <w:proofErr w:type="spellEnd"/>
+      <w:r>
+        <w:rPr>
+          <w:lang w:val="es-ES"/>
+        </w:rPr>
+        <w:t xml:space="preserve"> logs &gt; hacer un </w:t>
+      </w:r>
+      <w:proofErr w:type="gramStart"/>
+      <w:r>
+        <w:rPr>
+          <w:lang w:val="es-ES"/>
+        </w:rPr>
+        <w:t>show</w:t>
+      </w:r>
+      <w:proofErr w:type="gramEnd"/>
+      <w:r>
+        <w:rPr>
+          <w:lang w:val="es-ES"/>
+        </w:rPr>
+        <w:t xml:space="preserve"> del primero (id </w:t>
       </w:r>
       <w:r>
         <w:rPr>
@@ -2564,8 +2692,30 @@
         <w:rPr>
           <w:lang w:val="es-ES"/>
         </w:rPr>
-        <w:t>Non-functional requirements</w:t>
-      </w:r>
+        <w:t>Non-</w:t>
+      </w:r>
+      <w:proofErr w:type="spellStart"/>
+      <w:r>
+        <w:rPr>
+          <w:lang w:val="es-ES"/>
+        </w:rPr>
+        <w:t>functional</w:t>
+      </w:r>
+      <w:proofErr w:type="spellEnd"/>
+      <w:r>
+        <w:rPr>
+          <w:lang w:val="es-ES"/>
+        </w:rPr>
+        <w:t xml:space="preserve"> </w:t>
+      </w:r>
+      <w:proofErr w:type="spellStart"/>
+      <w:r>
+        <w:rPr>
+          <w:lang w:val="es-ES"/>
+        </w:rPr>
+        <w:t>requirements</w:t>
+      </w:r>
+      <w:proofErr w:type="spellEnd"/>
     </w:p>
     <w:p>
       <w:r>
@@ -2607,7 +2757,15 @@
         </w:rPr>
       </w:pPr>
       <w:r>
-        <w:t>Provide a link to your planning dashboard in GitHub to review the tasks, their current status, and your schedule</w:t>
+        <w:t xml:space="preserve">Provide a link to your planning dashboard in GitHub to review the tasks, their </w:t>
+      </w:r>
+      <w:proofErr w:type="gramStart"/>
+      <w:r>
+        <w:t>current status</w:t>
+      </w:r>
+      <w:proofErr w:type="gramEnd"/>
+      <w:r>
+        <w:t>, and your schedule</w:t>
       </w:r>
       <w:r>
         <w:t xml:space="preserve">.  </w:t>
@@ -2827,7 +2985,15 @@
         </w:rPr>
       </w:pPr>
       <w:r>
-        <w:t>Provide a link to your planning dashboard in GitHub to review the tasks, their current status, and your schedule</w:t>
+        <w:t xml:space="preserve">Provide a link to your planning dashboard in GitHub to review the tasks, their </w:t>
+      </w:r>
+      <w:proofErr w:type="gramStart"/>
+      <w:r>
+        <w:t>current status</w:t>
+      </w:r>
+      <w:proofErr w:type="gramEnd"/>
+      <w:r>
+        <w:t>, and your schedule</w:t>
       </w:r>
       <w:r>
         <w:t xml:space="preserve">. </w:t>
@@ -3376,9 +3542,6 @@
       </w:pPr>
       <w:sdt>
         <w:sdtPr>
-          <w:rPr>
-            <w:u w:val="single"/>
-          </w:rPr>
           <w:tag w:val="Verdict"/>
           <w:id w:val="55906619"/>
           <w:placeholder>
@@ -3389,21 +3552,12 @@
         </w:sdtPr>
         <w:sdtContent>
           <w:r>
-            <w:rPr>
-              <w:u w:val="single"/>
-            </w:rPr>
             <w:t xml:space="preserve"> </w:t>
           </w:r>
           <w:r>
-            <w:rPr>
-              <w:u w:val="single"/>
-            </w:rPr>
             <w:t>X</w:t>
           </w:r>
           <w:r>
-            <w:rPr>
-              <w:u w:val="single"/>
-            </w:rPr>
             <w:t xml:space="preserve">  </w:t>
           </w:r>
         </w:sdtContent>
@@ -3839,7 +3993,13 @@
         </w:sdtPr>
         <w:sdtContent>
           <w:r>
-            <w:t xml:space="preserve">    </w:t>
+            <w:t xml:space="preserve"> </w:t>
+          </w:r>
+          <w:r>
+            <w:t>X</w:t>
+          </w:r>
+          <w:r>
+            <w:t xml:space="preserve">   </w:t>
           </w:r>
         </w:sdtContent>
       </w:sdt>
@@ -8025,6 +8185,7 @@
     <w:rsid w:val="001221F0"/>
     <w:rsid w:val="001942D6"/>
     <w:rsid w:val="001B7228"/>
+    <w:rsid w:val="002243DD"/>
     <w:rsid w:val="00250265"/>
     <w:rsid w:val="002C1814"/>
     <w:rsid w:val="002E2B67"/>
@@ -8037,6 +8198,7 @@
     <w:rsid w:val="00423F74"/>
     <w:rsid w:val="004C054F"/>
     <w:rsid w:val="004D7778"/>
+    <w:rsid w:val="00514788"/>
     <w:rsid w:val="00532E78"/>
     <w:rsid w:val="005351FA"/>
     <w:rsid w:val="0057594D"/>

</xml_diff>